<commit_message>
fix: replace o2.edu.vn links in docx documents and rename -o2.edu_.vn_ files to giasu.ai.vn
</commit_message>
<xml_diff>
--- a/assets/docs/29.-Bai-1-Khai-niem-ve-can-ban-hoa-hoc-Vu-Bao-dap-an.docx
+++ b/assets/docs/29.-Bai-1-Khai-niem-ve-can-ban-hoa-hoc-Vu-Bao-dap-an.docx
@@ -14637,7 +14637,7 @@
           <w:rStyle w:val="Hyperlink"/>
           <w:rFonts w:ascii="Times New Roman" w:hAnsi="Times New Roman" w:cs="Times New Roman"/>
         </w:rPr>
-        <w:t>http://o2.edu.vn</w:t>
+        <w:t>https://giasu.ai.vn/</w:t>
       </w:r>
     </w:hyperlink>
     <w:bookmarkStart w:id="0" w:name="_GoBack"/>
@@ -14764,7 +14764,7 @@
           <w:rStyle w:val="Hyperlink"/>
           <w:rFonts w:ascii="Times New Roman" w:hAnsi="Times New Roman" w:cs="Times New Roman"/>
         </w:rPr>
-        <w:t>http://o2.edu.vn</w:t>
+        <w:t>https://giasu.ai.vn/</w:t>
       </w:r>
     </w:hyperlink>
   </w:p>

</xml_diff>